<commit_message>
Fix company name: Surestep, not Suresafe
</commit_message>
<xml_diff>
--- a/assets/cv/Shawn_Mbuvi_CV.docx
+++ b/assets/cv/Shawn_Mbuvi_CV.docx
@@ -54,7 +54,7 @@
       <w:pPr>
         <w:spacing w:after="200"/>
       </w:pPr>
-      <w:hyperlink w:history="1" r:id="rIdmdg3s8a6cgddran-u5lek">
+      <w:hyperlink w:history="1" r:id="rIdkfj_pdjck7ulrnuaoh8_g">
         <w:r>
           <w:rPr>
             <w:rFonts w:ascii="Calibri" w:cs="Calibri" w:eastAsia="Calibri" w:hAnsi="Calibri"/>
@@ -75,7 +75,7 @@
         </w:rPr>
         <w:t xml:space="preserve">   |   </w:t>
       </w:r>
-      <w:hyperlink w:history="1" r:id="rIdnpy3eexumwj0oxvrs7h3v">
+      <w:hyperlink w:history="1" r:id="rIdp2dn7msiuryr6sgd8g8up">
         <w:r>
           <w:rPr>
             <w:rFonts w:ascii="Calibri" w:cs="Calibri" w:eastAsia="Calibri" w:hAnsi="Calibri"/>
@@ -901,7 +901,7 @@
           <w:sz w:val="21"/>
           <w:szCs w:val="21"/>
         </w:rPr>
-        <w:t xml:space="preserve">  —  Suresafe Systems and Solutions</w:t>
+        <w:t xml:space="preserve">  —  Surestep Systems and Solutions</w:t>
       </w:r>
       <w:r>
         <w:rPr>

</xml_diff>

<commit_message>
Add portfolio site link to CV header
</commit_message>
<xml_diff>
--- a/assets/cv/Shawn_Mbuvi_CV.docx
+++ b/assets/cv/Shawn_Mbuvi_CV.docx
@@ -54,7 +54,7 @@
       <w:pPr>
         <w:spacing w:after="200"/>
       </w:pPr>
-      <w:hyperlink w:history="1" r:id="rIdkfj_pdjck7ulrnuaoh8_g">
+      <w:hyperlink w:history="1" r:id="rId-xzrapb4cgby1aiqpjzea">
         <w:r>
           <w:rPr>
             <w:rFonts w:ascii="Calibri" w:cs="Calibri" w:eastAsia="Calibri" w:hAnsi="Calibri"/>
@@ -75,7 +75,7 @@
         </w:rPr>
         <w:t xml:space="preserve">   |   </w:t>
       </w:r>
-      <w:hyperlink w:history="1" r:id="rIdp2dn7msiuryr6sgd8g8up">
+      <w:hyperlink w:history="1" r:id="rIdcyx-b-afqbeb4ip1nmsjl">
         <w:r>
           <w:rPr>
             <w:rFonts w:ascii="Calibri" w:cs="Calibri" w:eastAsia="Calibri" w:hAnsi="Calibri"/>
@@ -85,6 +85,27 @@
             <w:u w:val="single"/>
           </w:rPr>
           <w:t xml:space="preserve">github.com/Shawn72</w:t>
+        </w:r>
+      </w:hyperlink>
+      <w:r>
+        <w:rPr>
+          <w:rFonts w:ascii="Calibri" w:cs="Calibri" w:eastAsia="Calibri" w:hAnsi="Calibri"/>
+          <w:color w:val="555555"/>
+          <w:sz w:val="18"/>
+          <w:szCs w:val="18"/>
+        </w:rPr>
+        <w:t xml:space="preserve">   |   </w:t>
+      </w:r>
+      <w:hyperlink w:history="1" r:id="rIdnylv-f47rxqcq6xdfae_a">
+        <w:r>
+          <w:rPr>
+            <w:rFonts w:ascii="Calibri" w:cs="Calibri" w:eastAsia="Calibri" w:hAnsi="Calibri"/>
+            <w:color w:val="1155CC"/>
+            <w:sz w:val="18"/>
+            <w:szCs w:val="18"/>
+            <w:u w:val="single"/>
+          </w:rPr>
+          <w:t xml:space="preserve">shawn72.github.io/portfolio</w:t>
         </w:r>
       </w:hyperlink>
     </w:p>

</xml_diff>

<commit_message>
Add alternate phone number; update to Craft Silicon Ltd
</commit_message>
<xml_diff>
--- a/assets/cv/Shawn_Mbuvi_CV.docx
+++ b/assets/cv/Shawn_Mbuvi_CV.docx
@@ -47,14 +47,14 @@
           <w:sz w:val="18"/>
           <w:szCs w:val="18"/>
         </w:rPr>
-        <w:t xml:space="preserve">Mobile: +254 731 628 560   |   Email: shawnmbuvi@gmail.com   |   Nairobi, Kenya</w:t>
+        <w:t xml:space="preserve">Mobile: +254 731 628 560 / +254 727 088 016   |   Email: shawnmbuvi@gmail.com   |   Nairobi, Kenya</w:t>
       </w:r>
     </w:p>
     <w:p>
       <w:pPr>
         <w:spacing w:after="200"/>
       </w:pPr>
-      <w:hyperlink w:history="1" r:id="rId-xzrapb4cgby1aiqpjzea">
+      <w:hyperlink w:history="1" r:id="rIdkofvqzdmyiala79n9obdj">
         <w:r>
           <w:rPr>
             <w:rFonts w:ascii="Calibri" w:cs="Calibri" w:eastAsia="Calibri" w:hAnsi="Calibri"/>
@@ -75,7 +75,7 @@
         </w:rPr>
         <w:t xml:space="preserve">   |   </w:t>
       </w:r>
-      <w:hyperlink w:history="1" r:id="rIdcyx-b-afqbeb4ip1nmsjl">
+      <w:hyperlink w:history="1" r:id="rIdfcpwf5q9kxdueafebt7ec">
         <w:r>
           <w:rPr>
             <w:rFonts w:ascii="Calibri" w:cs="Calibri" w:eastAsia="Calibri" w:hAnsi="Calibri"/>
@@ -96,7 +96,7 @@
         </w:rPr>
         <w:t xml:space="preserve">   |   </w:t>
       </w:r>
-      <w:hyperlink w:history="1" r:id="rIdnylv-f47rxqcq6xdfae_a">
+      <w:hyperlink w:history="1" r:id="rId9hg3qiggplgxb_htevhln">
         <w:r>
           <w:rPr>
             <w:rFonts w:ascii="Calibri" w:cs="Calibri" w:eastAsia="Calibri" w:hAnsi="Calibri"/>
@@ -381,7 +381,7 @@
           <w:sz w:val="21"/>
           <w:szCs w:val="21"/>
         </w:rPr>
-        <w:t xml:space="preserve">  —  Craft Silicon</w:t>
+        <w:t xml:space="preserve">  —  Craft Silicon Ltd</w:t>
       </w:r>
       <w:r>
         <w:rPr>

</xml_diff>

<commit_message>
Fix surname spelling to NGUTTU on CV
</commit_message>
<xml_diff>
--- a/assets/cv/Shawn_Mbuvi_CV.docx
+++ b/assets/cv/Shawn_Mbuvi_CV.docx
@@ -17,7 +17,7 @@
           <w:sz w:val="40"/>
           <w:szCs w:val="40"/>
         </w:rPr>
-        <w:t xml:space="preserve">SHAWN MBUVI NGUTU</w:t>
+        <w:t xml:space="preserve">SHAWN MBUVI NGUTTU</w:t>
       </w:r>
     </w:p>
     <w:p>
@@ -54,7 +54,7 @@
       <w:pPr>
         <w:spacing w:after="200"/>
       </w:pPr>
-      <w:hyperlink w:history="1" r:id="rIdkofvqzdmyiala79n9obdj">
+      <w:hyperlink w:history="1" r:id="rIdiwtkt_adc70yoe7xwlfve">
         <w:r>
           <w:rPr>
             <w:rFonts w:ascii="Calibri" w:cs="Calibri" w:eastAsia="Calibri" w:hAnsi="Calibri"/>
@@ -75,7 +75,7 @@
         </w:rPr>
         <w:t xml:space="preserve">   |   </w:t>
       </w:r>
-      <w:hyperlink w:history="1" r:id="rIdfcpwf5q9kxdueafebt7ec">
+      <w:hyperlink w:history="1" r:id="rIdjq1tge9vksymv4u1tpy-6">
         <w:r>
           <w:rPr>
             <w:rFonts w:ascii="Calibri" w:cs="Calibri" w:eastAsia="Calibri" w:hAnsi="Calibri"/>
@@ -96,7 +96,7 @@
         </w:rPr>
         <w:t xml:space="preserve">   |   </w:t>
       </w:r>
-      <w:hyperlink w:history="1" r:id="rId9hg3qiggplgxb_htevhln">
+      <w:hyperlink w:history="1" r:id="rIdbiz0y1h5gqrv4as6wwvii">
         <w:r>
           <w:rPr>
             <w:rFonts w:ascii="Calibri" w:cs="Calibri" w:eastAsia="Calibri" w:hAnsi="Calibri"/>

</xml_diff>